<commit_message>
마. 보장의 보험금의 현가를 배수 × M 의 차로 — PVB = 1·M_x + 0.5·( M_{x+0.25} − M_{x+n} )
- 종신은 − M_{x+n} 없음, 면책은 M 의 시작(90일 → x+0.25), 삭감은 ρ·( M_{x+a} − M_{x+r} ) + M_{x+r} − M_{x+n}
- 정액 보장은 배수 없이, S_t 를 고친 보장·연령 구간·생존급부는 그 S_t 줄과 Σ S_u·C
- B02 보장 카드의 식도 같게 · 표준 Word·샘플 docx/pdf 재생성

Co-Authored-By: Claude Opus 5.5 (1M context) <noreply@anthropic.com>
Claude-Session: https://claude.ai/code/session_01PDvGzeRFfSvmZWyqdsnKcR
</commit_message>
<xml_diff>
--- a/samples/10_기본상품_종신보험(암진단포함)_산출방법서.docx
+++ b/samples/10_기본상품_종신보험(암진단포함)_산출방법서.docx
@@ -4223,253 +4223,6 @@
     <w:p/>
     <w:p>
       <w:pPr>
-        <w:pStyle w:val="FormulaText"/>
-      </w:pPr>
-      <w:r>
-        <w:t xml:space="preserve">사망·80% 이상 장해</w:t>
-      </w:r>
-    </w:p>
-    <w:p>
-      <w:pPr>
-        <w:pStyle w:val="Formula"/>
-      </w:pPr>
-      <m:oMathPara>
-        <m:oMathParaPr>
-          <m:jc m:val="left"/>
-        </m:oMathParaPr>
-        <m:oMath>
-          <m:sSub>
-            <m:e>
-              <m:r>
-                <w:rPr>
-                  <w:rFonts w:ascii="Cambria Math" w:hAnsi="Cambria Math"/>
-                  <w:sz w:val="24"/>
-                  <w:szCs w:val="24"/>
-                </w:rPr>
-                <m:t xml:space="preserve">S</m:t>
-              </m:r>
-            </m:e>
-            <m:sub>
-              <m:r>
-                <w:rPr>
-                  <w:rFonts w:ascii="Cambria Math" w:hAnsi="Cambria Math"/>
-                  <w:sz w:val="24"/>
-                  <w:szCs w:val="24"/>
-                </w:rPr>
-                <m:t xml:space="preserve">t</m:t>
-              </m:r>
-            </m:sub>
-          </m:sSub>
-          <m:r>
-            <w:rPr>
-              <w:rFonts w:ascii="Cambria Math" w:hAnsi="Cambria Math"/>
-              <w:sz w:val="24"/>
-              <w:szCs w:val="24"/>
-            </w:rPr>
-            <m:t xml:space="preserve"> = </m:t>
-          </m:r>
-          <m:r>
-            <w:rPr>
-              <w:rFonts w:ascii="Cambria Math" w:hAnsi="Cambria Math"/>
-              <w:sz w:val="24"/>
-              <w:szCs w:val="24"/>
-            </w:rPr>
-            <m:t xml:space="preserve">1</m:t>
-          </m:r>
-        </m:oMath>
-      </m:oMathPara>
-    </w:p>
-    <w:p>
-      <w:pPr>
-        <w:pStyle w:val="FormulaText"/>
-      </w:pPr>
-      <w:r>
-        <w:t xml:space="preserve">암 진단</w:t>
-      </w:r>
-    </w:p>
-    <w:p>
-      <w:pPr>
-        <w:pStyle w:val="Formula"/>
-      </w:pPr>
-      <m:oMathPara>
-        <m:oMathParaPr>
-          <m:jc m:val="left"/>
-        </m:oMathParaPr>
-        <m:oMath>
-          <m:sSub>
-            <m:e>
-              <m:r>
-                <w:rPr>
-                  <w:rFonts w:ascii="Cambria Math" w:hAnsi="Cambria Math"/>
-                  <w:sz w:val="24"/>
-                  <w:szCs w:val="24"/>
-                </w:rPr>
-                <m:t xml:space="preserve">S</m:t>
-              </m:r>
-            </m:e>
-            <m:sub>
-              <m:r>
-                <w:rPr>
-                  <w:rFonts w:ascii="Cambria Math" w:hAnsi="Cambria Math"/>
-                  <w:sz w:val="24"/>
-                  <w:szCs w:val="24"/>
-                </w:rPr>
-                <m:t xml:space="preserve">t</m:t>
-              </m:r>
-            </m:sub>
-          </m:sSub>
-          <m:r>
-            <w:rPr>
-              <w:rFonts w:ascii="Cambria Math" w:hAnsi="Cambria Math"/>
-              <w:sz w:val="24"/>
-              <w:szCs w:val="24"/>
-            </w:rPr>
-            <m:t xml:space="preserve"> = </m:t>
-          </m:r>
-          <m:r>
-            <w:rPr>
-              <w:rFonts w:ascii="Cambria Math" w:hAnsi="Cambria Math"/>
-              <w:sz w:val="24"/>
-              <w:szCs w:val="24"/>
-            </w:rPr>
-            <m:t xml:space="preserve">1</m:t>
-          </m:r>
-          <m:r>
-            <w:rPr>
-              <w:rFonts w:ascii="Cambria Math" w:hAnsi="Cambria Math"/>
-              <w:sz w:val="24"/>
-              <w:szCs w:val="24"/>
-            </w:rPr>
-            <m:t xml:space="preserve"> × </m:t>
-          </m:r>
-          <m:r>
-            <m:rPr>
-              <m:nor/>
-            </m:rPr>
-            <w:rPr>
-              <w:rFonts w:ascii="Cambria Math" w:hAnsi="Cambria Math"/>
-              <w:sz w:val="24"/>
-              <w:szCs w:val="24"/>
-            </w:rPr>
-            <m:t xml:space="preserve">if</m:t>
-          </m:r>
-          <m:r>
-            <w:rPr>
-              <w:rFonts w:ascii="Cambria Math" w:hAnsi="Cambria Math"/>
-              <w:sz w:val="24"/>
-              <w:szCs w:val="24"/>
-            </w:rPr>
-            <m:t xml:space="preserve">( </m:t>
-          </m:r>
-          <m:r>
-            <w:rPr>
-              <w:rFonts w:ascii="Cambria Math" w:hAnsi="Cambria Math"/>
-              <w:sz w:val="24"/>
-              <w:szCs w:val="24"/>
-            </w:rPr>
-            <m:t xml:space="preserve">t</m:t>
-          </m:r>
-          <m:r>
-            <w:rPr>
-              <w:rFonts w:ascii="Cambria Math" w:hAnsi="Cambria Math"/>
-              <w:sz w:val="24"/>
-              <w:szCs w:val="24"/>
-            </w:rPr>
-            <m:t xml:space="preserve"> = </m:t>
-          </m:r>
-          <m:r>
-            <w:rPr>
-              <w:rFonts w:ascii="Cambria Math" w:hAnsi="Cambria Math"/>
-              <w:sz w:val="24"/>
-              <w:szCs w:val="24"/>
-            </w:rPr>
-            <m:t xml:space="preserve">0</m:t>
-          </m:r>
-          <m:r>
-            <w:rPr>
-              <w:rFonts w:ascii="Cambria Math" w:hAnsi="Cambria Math"/>
-              <w:sz w:val="24"/>
-              <w:szCs w:val="24"/>
-            </w:rPr>
-            <m:t xml:space="preserve">, </m:t>
-          </m:r>
-          <m:r>
-            <w:rPr>
-              <w:rFonts w:ascii="Cambria Math" w:hAnsi="Cambria Math"/>
-              <w:sz w:val="24"/>
-              <w:szCs w:val="24"/>
-            </w:rPr>
-            <m:t xml:space="preserve">1</m:t>
-          </m:r>
-          <m:r>
-            <w:rPr>
-              <w:rFonts w:ascii="Cambria Math" w:hAnsi="Cambria Math"/>
-              <w:sz w:val="24"/>
-              <w:szCs w:val="24"/>
-            </w:rPr>
-            <m:t xml:space="preserve"> − </m:t>
-          </m:r>
-          <m:r>
-            <w:rPr>
-              <w:rFonts w:ascii="Cambria Math" w:hAnsi="Cambria Math"/>
-              <w:sz w:val="24"/>
-              <w:szCs w:val="24"/>
-            </w:rPr>
-            <m:t xml:space="preserve">3</m:t>
-          </m:r>
-          <m:r>
-            <w:rPr>
-              <w:rFonts w:ascii="Cambria Math" w:hAnsi="Cambria Math"/>
-              <w:sz w:val="24"/>
-              <w:szCs w:val="24"/>
-            </w:rPr>
-            <m:t xml:space="preserve">/</m:t>
-          </m:r>
-          <m:r>
-            <w:rPr>
-              <w:rFonts w:ascii="Cambria Math" w:hAnsi="Cambria Math"/>
-              <w:sz w:val="24"/>
-              <w:szCs w:val="24"/>
-            </w:rPr>
-            <m:t xml:space="preserve">12</m:t>
-          </m:r>
-          <m:r>
-            <w:rPr>
-              <w:rFonts w:ascii="Cambria Math" w:hAnsi="Cambria Math"/>
-              <w:sz w:val="24"/>
-              <w:szCs w:val="24"/>
-            </w:rPr>
-            <m:t xml:space="preserve">, </m:t>
-          </m:r>
-          <m:r>
-            <w:rPr>
-              <w:rFonts w:ascii="Cambria Math" w:hAnsi="Cambria Math"/>
-              <w:sz w:val="24"/>
-              <w:szCs w:val="24"/>
-            </w:rPr>
-            <m:t xml:space="preserve">1</m:t>
-          </m:r>
-          <m:r>
-            <w:rPr>
-              <w:rFonts w:ascii="Cambria Math" w:hAnsi="Cambria Math"/>
-              <w:sz w:val="24"/>
-              <w:szCs w:val="24"/>
-            </w:rPr>
-            <m:t xml:space="preserve"> )</m:t>
-          </m:r>
-        </m:oMath>
-      </m:oMathPara>
-    </w:p>
-    <w:p>
-      <w:pPr>
-        <w:pStyle w:val="FormulaText"/>
-      </w:pPr>
-      <w:r>
-        <w:t xml:space="preserve">보험금의 현가 — 보장마다</w:t>
-      </w:r>
-    </w:p>
-    <w:p>
-      <w:pPr>
         <w:pStyle w:val="Formula"/>
       </w:pPr>
       <m:oMathPara>
@@ -4496,100 +4249,14 @@
             </w:rPr>
             <m:t xml:space="preserve"> = </m:t>
           </m:r>
-          <m:sSubSup>
-            <m:e>
-              <m:r>
-                <w:rPr>
-                  <w:rFonts w:ascii="Cambria Math" w:hAnsi="Cambria Math"/>
-                  <w:sz w:val="24"/>
-                  <w:szCs w:val="24"/>
-                </w:rPr>
-                <m:t xml:space="preserve">Σ</m:t>
-              </m:r>
-            </m:e>
-            <m:sub>
-              <m:r>
-                <w:rPr>
-                  <w:rFonts w:ascii="Cambria Math" w:hAnsi="Cambria Math"/>
-                  <w:sz w:val="24"/>
-                  <w:szCs w:val="24"/>
-                </w:rPr>
-                <m:t xml:space="preserve">u</m:t>
-              </m:r>
-              <m:r>
-                <w:rPr>
-                  <w:rFonts w:ascii="Cambria Math" w:hAnsi="Cambria Math"/>
-                  <w:sz w:val="24"/>
-                  <w:szCs w:val="24"/>
-                </w:rPr>
-                <m:t xml:space="preserve">=</m:t>
-              </m:r>
-              <m:r>
-                <w:rPr>
-                  <w:rFonts w:ascii="Cambria Math" w:hAnsi="Cambria Math"/>
-                  <w:sz w:val="24"/>
-                  <w:szCs w:val="24"/>
-                </w:rPr>
-                <m:t xml:space="preserve">0</m:t>
-              </m:r>
-            </m:sub>
-            <m:sup>
-              <m:r>
-                <w:rPr>
-                  <w:rFonts w:ascii="Cambria Math" w:hAnsi="Cambria Math"/>
-                  <w:sz w:val="24"/>
-                  <w:szCs w:val="24"/>
-                </w:rPr>
-                <m:t xml:space="preserve">n</m:t>
-              </m:r>
-              <m:r>
-                <w:rPr>
-                  <w:rFonts w:ascii="Cambria Math" w:hAnsi="Cambria Math"/>
-                  <w:sz w:val="24"/>
-                  <w:szCs w:val="24"/>
-                </w:rPr>
-                <m:t xml:space="preserve">−</m:t>
-              </m:r>
-              <m:r>
-                <w:rPr>
-                  <w:rFonts w:ascii="Cambria Math" w:hAnsi="Cambria Math"/>
-                  <w:sz w:val="24"/>
-                  <w:szCs w:val="24"/>
-                </w:rPr>
-                <m:t xml:space="preserve">1</m:t>
-              </m:r>
-            </m:sup>
-          </m:sSubSup>
           <m:r>
             <w:rPr>
               <w:rFonts w:ascii="Cambria Math" w:hAnsi="Cambria Math"/>
               <w:sz w:val="24"/>
               <w:szCs w:val="24"/>
             </w:rPr>
-            <m:t xml:space="preserve"> </m:t>
+            <m:t xml:space="preserve">1</m:t>
           </m:r>
-          <m:sSub>
-            <m:e>
-              <m:r>
-                <w:rPr>
-                  <w:rFonts w:ascii="Cambria Math" w:hAnsi="Cambria Math"/>
-                  <w:sz w:val="24"/>
-                  <w:szCs w:val="24"/>
-                </w:rPr>
-                <m:t xml:space="preserve">S</m:t>
-              </m:r>
-            </m:e>
-            <m:sub>
-              <m:r>
-                <w:rPr>
-                  <w:rFonts w:ascii="Cambria Math" w:hAnsi="Cambria Math"/>
-                  <w:sz w:val="24"/>
-                  <w:szCs w:val="24"/>
-                </w:rPr>
-                <m:t xml:space="preserve">u</m:t>
-              </m:r>
-            </m:sub>
-          </m:sSub>
           <m:r>
             <w:rPr>
               <w:rFonts w:ascii="Cambria Math" w:hAnsi="Cambria Math"/>
@@ -4606,7 +4273,69 @@
                   <w:sz w:val="24"/>
                   <w:szCs w:val="24"/>
                 </w:rPr>
-                <m:t xml:space="preserve">C</m:t>
+                <m:t xml:space="preserve">M</m:t>
+              </m:r>
+            </m:e>
+            <m:sub>
+              <m:r>
+                <w:rPr>
+                  <w:rFonts w:ascii="Cambria Math" w:hAnsi="Cambria Math"/>
+                  <w:sz w:val="24"/>
+                  <w:szCs w:val="24"/>
+                </w:rPr>
+                <m:t xml:space="preserve">x</m:t>
+              </m:r>
+            </m:sub>
+          </m:sSub>
+          <m:r>
+            <w:rPr>
+              <w:rFonts w:ascii="Cambria Math" w:hAnsi="Cambria Math"/>
+              <w:sz w:val="24"/>
+              <w:szCs w:val="24"/>
+            </w:rPr>
+            <m:t xml:space="preserve"> + </m:t>
+          </m:r>
+          <m:r>
+            <w:rPr>
+              <w:rFonts w:ascii="Cambria Math" w:hAnsi="Cambria Math"/>
+              <w:sz w:val="24"/>
+              <w:szCs w:val="24"/>
+            </w:rPr>
+            <m:t xml:space="preserve">0</m:t>
+          </m:r>
+          <m:r>
+            <w:rPr>
+              <w:rFonts w:ascii="Cambria Math" w:hAnsi="Cambria Math"/>
+              <w:sz w:val="24"/>
+              <w:szCs w:val="24"/>
+            </w:rPr>
+            <m:t xml:space="preserve">.</m:t>
+          </m:r>
+          <m:r>
+            <w:rPr>
+              <w:rFonts w:ascii="Cambria Math" w:hAnsi="Cambria Math"/>
+              <w:sz w:val="24"/>
+              <w:szCs w:val="24"/>
+            </w:rPr>
+            <m:t xml:space="preserve">5</m:t>
+          </m:r>
+          <m:r>
+            <w:rPr>
+              <w:rFonts w:ascii="Cambria Math" w:hAnsi="Cambria Math"/>
+              <w:sz w:val="24"/>
+              <w:szCs w:val="24"/>
+            </w:rPr>
+            <m:t xml:space="preserve">·( </m:t>
+          </m:r>
+          <m:sSub>
+            <m:e>
+              <m:r>
+                <w:rPr>
+                  <w:rFonts w:ascii="Cambria Math" w:hAnsi="Cambria Math"/>
+                  <w:sz w:val="24"/>
+                  <w:szCs w:val="24"/>
+                </w:rPr>
+                <m:t xml:space="preserve">M</m:t>
               </m:r>
             </m:e>
             <m:sub>
@@ -4632,10 +4361,80 @@
                   <w:sz w:val="24"/>
                   <w:szCs w:val="24"/>
                 </w:rPr>
-                <m:t xml:space="preserve">u</m:t>
+                <m:t xml:space="preserve">0</m:t>
+              </m:r>
+              <m:r>
+                <w:rPr>
+                  <w:rFonts w:ascii="Cambria Math" w:hAnsi="Cambria Math"/>
+                  <w:sz w:val="24"/>
+                  <w:szCs w:val="24"/>
+                </w:rPr>
+                <m:t xml:space="preserve">.</m:t>
+              </m:r>
+              <m:r>
+                <w:rPr>
+                  <w:rFonts w:ascii="Cambria Math" w:hAnsi="Cambria Math"/>
+                  <w:sz w:val="24"/>
+                  <w:szCs w:val="24"/>
+                </w:rPr>
+                <m:t xml:space="preserve">25</m:t>
               </m:r>
             </m:sub>
           </m:sSub>
+          <m:r>
+            <w:rPr>
+              <w:rFonts w:ascii="Cambria Math" w:hAnsi="Cambria Math"/>
+              <w:sz w:val="24"/>
+              <w:szCs w:val="24"/>
+            </w:rPr>
+            <m:t xml:space="preserve"> − </m:t>
+          </m:r>
+          <m:sSub>
+            <m:e>
+              <m:r>
+                <w:rPr>
+                  <w:rFonts w:ascii="Cambria Math" w:hAnsi="Cambria Math"/>
+                  <w:sz w:val="24"/>
+                  <w:szCs w:val="24"/>
+                </w:rPr>
+                <m:t xml:space="preserve">M</m:t>
+              </m:r>
+            </m:e>
+            <m:sub>
+              <m:r>
+                <w:rPr>
+                  <w:rFonts w:ascii="Cambria Math" w:hAnsi="Cambria Math"/>
+                  <w:sz w:val="24"/>
+                  <w:szCs w:val="24"/>
+                </w:rPr>
+                <m:t xml:space="preserve">x</m:t>
+              </m:r>
+              <m:r>
+                <w:rPr>
+                  <w:rFonts w:ascii="Cambria Math" w:hAnsi="Cambria Math"/>
+                  <w:sz w:val="24"/>
+                  <w:szCs w:val="24"/>
+                </w:rPr>
+                <m:t xml:space="preserve">+</m:t>
+              </m:r>
+              <m:r>
+                <w:rPr>
+                  <w:rFonts w:ascii="Cambria Math" w:hAnsi="Cambria Math"/>
+                  <w:sz w:val="24"/>
+                  <w:szCs w:val="24"/>
+                </w:rPr>
+                <m:t xml:space="preserve">n</m:t>
+              </m:r>
+            </m:sub>
+          </m:sSub>
+          <m:r>
+            <w:rPr>
+              <w:rFonts w:ascii="Cambria Math" w:hAnsi="Cambria Math"/>
+              <w:sz w:val="24"/>
+              <w:szCs w:val="24"/>
+            </w:rPr>
+            <m:t xml:space="preserve"> )</m:t>
+          </m:r>
         </m:oMath>
       </m:oMathPara>
     </w:p>

</xml_diff>